<commit_message>
feat: desbloqueo ultra-practico de camas en 1 clic y documento word operativo
</commit_message>
<xml_diff>
--- a/SOLUCION_ADELANTO_CICLO_DESBLOQUEO_CAMAS.docx
+++ b/SOLUCION_ADELANTO_CICLO_DESBLOQUEO_CAMAS.docx
@@ -14,7 +14,7 @@
           <w:color w:val="558B2F"/>
           <w:sz w:val="19"/>
         </w:rPr>
-        <w:t>BUENAVISTA FLOWERS • SISTEMA DE GESTIÓN INTEGRAL DE SIEMBRAS</w:t>
+        <w:t>BUENAVISTA FLOWERS • GESTIÓN AGRONÓMICA INTELIGENTE DE SIEMBRAS</w:t>
       </w:r>
     </w:p>
     <w:p>
@@ -26,16 +26,16 @@
           <w:rFonts w:ascii="Calibri" w:hAnsi="Calibri"/>
           <w:b/>
           <w:color w:val="1B5E20"/>
-          <w:sz w:val="34"/>
+          <w:sz w:val="33"/>
         </w:rPr>
-        <w:t>PROTOCOLO OPERATIVO Y SOLUCIÓN TÉCNICA:</w:t>
+        <w:t>GUÍA PRÁCTICA DE CAMPO:</w:t>
         <w:br/>
-        <w:t>DESBLOQUEO DE CAMAS POR ADELANTO DE CICLO VEGETATIVO NATURAL</w:t>
+        <w:t>DESBLOQUEO Y REUTILIZACIÓN INMEDIATA DE CAMAS ANTE ADELANTOS NATURALES DE COSECHA</w:t>
       </w:r>
     </w:p>
     <w:p>
       <w:pPr>
-        <w:spacing w:before="0" w:after="280"/>
+        <w:spacing w:before="0" w:after="240"/>
       </w:pPr>
       <w:r>
         <w:rPr>
@@ -44,12 +44,12 @@
           <w:color w:val="757575"/>
           <w:sz w:val="19"/>
         </w:rPr>
-        <w:t>Procedimiento Estándar (SOP-AGRO-004) | Aplicación Móvil &amp; Base de Datos Access | Octubre 2026</w:t>
+        <w:t>Manual de Operación Rápida en Invernadero (1 Clic) • Aplicación Móvil Android &amp; Access • Actualizado Octubre 2026</w:t>
       </w:r>
     </w:p>
     <w:p>
       <w:pPr>
-        <w:spacing w:before="0" w:after="240"/>
+        <w:spacing w:before="0" w:after="200"/>
       </w:pPr>
       <w:r>
         <w:rPr>
@@ -62,7 +62,7 @@
     <w:p>
       <w:pPr>
         <w:pStyle w:val="Heading1"/>
-        <w:spacing w:before="200" w:after="80"/>
+        <w:spacing w:before="160" w:after="80"/>
       </w:pPr>
       <w:r>
         <w:rPr>
@@ -70,91 +70,7 @@
           <w:color w:val="1B5E20"/>
           <w:sz w:val="26"/>
         </w:rPr>
-        <w:t>1. Descripción del Caso Hipotético</w:t>
-      </w:r>
-    </w:p>
-    <w:p>
-      <w:pPr>
-        <w:spacing w:line="276" w:lineRule="auto" w:after="160"/>
-      </w:pPr>
-      <w:r>
-        <w:rPr>
-          <w:i/>
-        </w:rPr>
-        <w:t>Caso planteado: «Si alguna variedad se adelanta en el ciclo por factores naturales (radiación solar favorable, temperaturas altas, excelente enraizamiento, etc.), se procede al corte completo de la flor en la cama y se necesita utilizar y sembrar de nuevo de inmediato; sin embargo, el sistema y la base de datos mantienen la cama bloqueada indicando que el ciclo agronómico teórico aún no se ha cumplido. ¿Cómo se soluciona de forma operativa y definitiva?»</w:t>
-      </w:r>
-    </w:p>
-    <w:tbl>
-      <w:tblPr>
-        <w:tblW w:type="auto" w:w="0"/>
-        <w:jc w:val="center"/>
-        <w:tblLayout w:type="fixed"/>
-        <w:tblLook w:firstColumn="1" w:firstRow="1" w:lastColumn="0" w:lastRow="0" w:noHBand="0" w:noVBand="1" w:val="04A0"/>
-      </w:tblPr>
-      <w:tblGrid>
-        <w:gridCol w:w="9360"/>
-      </w:tblGrid>
-      <w:tr>
-        <w:tc>
-          <w:tcPr>
-            <w:tcW w:type="dxa" w:w="9360"/>
-            <w:shd w:fill="F1F8E9"/>
-            <w:tcBorders>
-              <w:left w:val="single" w:sz="36" w:space="0" w:color="33691E"/>
-              <w:top w:val="none"/>
-              <w:bottom w:val="none"/>
-              <w:right w:val="none"/>
-            </w:tcBorders>
-            <w:tcMar>
-              <w:top w:w="140" w:type="dxa"/>
-              <w:bottom w:w="140" w:type="dxa"/>
-              <w:left w:w="200" w:type="dxa"/>
-              <w:right w:w="180" w:type="dxa"/>
-            </w:tcMar>
-          </w:tcPr>
-          <w:p>
-            <w:pPr>
-              <w:spacing w:before="0" w:after="80" w:line="276" w:lineRule="auto"/>
-            </w:pPr>
-            <w:r>
-              <w:rPr>
-                <w:rFonts w:ascii="Calibri" w:hAnsi="Calibri"/>
-                <w:b/>
-                <w:color w:val="33691E"/>
-                <w:sz w:val="22"/>
-              </w:rPr>
-              <w:t>📌 Diagnóstico Rápido del Problema</w:t>
-              <w:br/>
-            </w:r>
-            <w:r>
-              <w:rPr>
-                <w:rFonts w:ascii="Calibri" w:hAnsi="Calibri"/>
-                <w:color w:val="263238"/>
-                <w:sz w:val="20"/>
-              </w:rPr>
-              <w:t>El bloqueo ocurre porque el software implementa una regla agronómica de seguridad preventiva diseñada para evitar que dos lotes choquen o se sobre-siembren por error. Cuando el clima o la biología adelantan la cosecha real respecto a la fecha teórica estimada, el sistema requiere una confirmación formal de corte o ajuste de parámetros para liberar la cama.</w:t>
-            </w:r>
-          </w:p>
-        </w:tc>
-      </w:tr>
-    </w:tbl>
-    <w:p>
-      <w:pPr>
-        <w:spacing w:before="0" w:after="120"/>
-      </w:pPr>
-    </w:p>
-    <w:p>
-      <w:pPr>
-        <w:pStyle w:val="Heading1"/>
-        <w:spacing w:before="240" w:after="80"/>
-      </w:pPr>
-      <w:r>
-        <w:rPr>
-          <w:rFonts w:ascii="Calibri" w:hAnsi="Calibri"/>
-          <w:color w:val="1B5E20"/>
-          <w:sz w:val="26"/>
-        </w:rPr>
-        <w:t>2. Diagnóstico Técnico: Los Dos Mecanismos de Bloqueo</w:t>
+        <w:t>1. El Problema en Campo: La Realidad Biológica vs. La Base de Datos</w:t>
       </w:r>
     </w:p>
     <w:p>
@@ -162,624 +78,18 @@
         <w:spacing w:line="276" w:lineRule="auto" w:after="120"/>
       </w:pPr>
       <w:r>
-        <w:t>En el ecosistema tecnológico de Siembras (App Móvil Flutter + SQLite local + Base de Datos Central Access bmempresarial2021.accdb), el estado de una cama está gobernado por dos validaciones concurrentes:</w:t>
-      </w:r>
-    </w:p>
-    <w:tbl>
-      <w:tblPr>
-        <w:tblW w:type="auto" w:w="0"/>
-        <w:jc w:val="center"/>
-        <w:tblLayout w:type="fixed"/>
-        <w:tblLook w:firstColumn="1" w:firstRow="1" w:lastColumn="0" w:lastRow="0" w:noHBand="0" w:noVBand="1" w:val="04A0"/>
-        <w:tblBorders>
-          <w:top w:val="single" w:sz="4" w:space="0" w:color="D0D7DE"/>
-          <w:left w:val="single" w:sz="4" w:space="0" w:color="D0D7DE"/>
-          <w:bottom w:val="single" w:sz="4" w:space="0" w:color="D0D7DE"/>
-          <w:right w:val="single" w:sz="4" w:space="0" w:color="D0D7DE"/>
-          <w:insideH w:val="single" w:sz="4" w:space="0" w:color="D0D7DE"/>
-          <w:insideV w:val="single" w:sz="4" w:space="0" w:color="D0D7DE"/>
-        </w:tblBorders>
-      </w:tblPr>
-      <w:tblGrid>
-        <w:gridCol w:w="1872"/>
-        <w:gridCol w:w="3168"/>
-        <w:gridCol w:w="4320"/>
-      </w:tblGrid>
-      <w:tr>
-        <w:tc>
-          <w:tcPr>
-            <w:tcW w:type="dxa" w:w="3120"/>
-            <w:shd w:fill="2E7D32"/>
-            <w:tcMar>
-              <w:top w:w="100" w:type="dxa"/>
-              <w:bottom w:w="100" w:type="dxa"/>
-              <w:left w:w="120" w:type="dxa"/>
-              <w:right w:w="120" w:type="dxa"/>
-            </w:tcMar>
-          </w:tcPr>
-          <w:p>
-            <w:r>
-              <w:rPr>
-                <w:rFonts w:ascii="Calibri" w:hAnsi="Calibri"/>
-                <w:b/>
-                <w:color w:val="FFFFFF"/>
-                <w:sz w:val="20"/>
-              </w:rPr>
-              <w:t>Componente</w:t>
-            </w:r>
-          </w:p>
-        </w:tc>
-        <w:tc>
-          <w:tcPr>
-            <w:tcW w:type="dxa" w:w="3120"/>
-            <w:shd w:fill="2E7D32"/>
-            <w:tcMar>
-              <w:top w:w="100" w:type="dxa"/>
-              <w:bottom w:w="100" w:type="dxa"/>
-              <w:left w:w="120" w:type="dxa"/>
-              <w:right w:w="120" w:type="dxa"/>
-            </w:tcMar>
-          </w:tcPr>
-          <w:p>
-            <w:r>
-              <w:rPr>
-                <w:rFonts w:ascii="Calibri" w:hAnsi="Calibri"/>
-                <w:b/>
-                <w:color w:val="FFFFFF"/>
-                <w:sz w:val="20"/>
-              </w:rPr>
-              <w:t>Causa del Bloqueo</w:t>
-            </w:r>
-          </w:p>
-        </w:tc>
-        <w:tc>
-          <w:tcPr>
-            <w:tcW w:type="dxa" w:w="3120"/>
-            <w:shd w:fill="2E7D32"/>
-            <w:tcMar>
-              <w:top w:w="100" w:type="dxa"/>
-              <w:bottom w:w="100" w:type="dxa"/>
-              <w:left w:w="120" w:type="dxa"/>
-              <w:right w:w="120" w:type="dxa"/>
-            </w:tcMar>
-          </w:tcPr>
-          <w:p>
-            <w:r>
-              <w:rPr>
-                <w:rFonts w:ascii="Calibri" w:hAnsi="Calibri"/>
-                <w:b/>
-                <w:color w:val="FFFFFF"/>
-                <w:sz w:val="20"/>
-              </w:rPr>
-              <w:t>Efecto en Pantalla</w:t>
-            </w:r>
-          </w:p>
-        </w:tc>
-      </w:tr>
-      <w:tr>
-        <w:tc>
-          <w:tcPr>
-            <w:tcW w:type="dxa" w:w="3120"/>
-            <w:shd w:fill="F9FBE7"/>
-            <w:tcMar>
-              <w:top w:w="80" w:type="dxa"/>
-              <w:bottom w:w="80" w:type="dxa"/>
-              <w:left w:w="100" w:type="dxa"/>
-              <w:right w:w="100" w:type="dxa"/>
-            </w:tcMar>
-          </w:tcPr>
-          <w:p>
-            <w:pPr>
-              <w:spacing w:line="264" w:lineRule="auto"/>
-            </w:pPr>
-            <w:r>
-              <w:rPr>
-                <w:rFonts w:ascii="Calibri" w:hAnsi="Calibri"/>
-                <w:b/>
-                <w:color w:val="263238"/>
-                <w:sz w:val="19"/>
-              </w:rPr>
-              <w:t>Causa A:</w:t>
-              <w:br/>
-              <w:t>Estado de Siembra</w:t>
-            </w:r>
-          </w:p>
-        </w:tc>
-        <w:tc>
-          <w:tcPr>
-            <w:tcW w:type="dxa" w:w="3120"/>
-            <w:shd w:fill="F9FBE7"/>
-            <w:tcMar>
-              <w:top w:w="80" w:type="dxa"/>
-              <w:bottom w:w="80" w:type="dxa"/>
-              <w:left w:w="100" w:type="dxa"/>
-              <w:right w:w="100" w:type="dxa"/>
-            </w:tcMar>
-          </w:tcPr>
-          <w:p>
-            <w:pPr>
-              <w:spacing w:line="264" w:lineRule="auto"/>
-            </w:pPr>
-            <w:r>
-              <w:rPr>
-                <w:rFonts w:ascii="Calibri" w:hAnsi="Calibri"/>
-                <w:color w:val="263238"/>
-                <w:sz w:val="19"/>
-              </w:rPr>
-              <w:t>La siembra previa permanece en estado 'ACTIVA' porque el corte no fue reportado en la app.</w:t>
-            </w:r>
-          </w:p>
-        </w:tc>
-        <w:tc>
-          <w:tcPr>
-            <w:tcW w:type="dxa" w:w="3120"/>
-            <w:shd w:fill="F9FBE7"/>
-            <w:tcMar>
-              <w:top w:w="80" w:type="dxa"/>
-              <w:bottom w:w="80" w:type="dxa"/>
-              <w:left w:w="100" w:type="dxa"/>
-              <w:right w:w="100" w:type="dxa"/>
-            </w:tcMar>
-          </w:tcPr>
-          <w:p>
-            <w:pPr>
-              <w:spacing w:line="264" w:lineRule="auto"/>
-            </w:pPr>
-            <w:r>
-              <w:rPr>
-                <w:rFonts w:ascii="Calibri" w:hAnsi="Calibri"/>
-                <w:color w:val="263238"/>
-                <w:sz w:val="19"/>
-              </w:rPr>
-              <w:t>Al intentar sembrar, la app reporta: 'Cama Ocupada / Cupo Lleno' y prohíbe nueva siembra.</w:t>
-            </w:r>
-          </w:p>
-        </w:tc>
-      </w:tr>
-      <w:tr>
-        <w:tc>
-          <w:tcPr>
-            <w:tcW w:type="dxa" w:w="3120"/>
-            <w:shd w:fill="FFFFFF"/>
-            <w:tcMar>
-              <w:top w:w="80" w:type="dxa"/>
-              <w:bottom w:w="80" w:type="dxa"/>
-              <w:left w:w="100" w:type="dxa"/>
-              <w:right w:w="100" w:type="dxa"/>
-            </w:tcMar>
-          </w:tcPr>
-          <w:p>
-            <w:pPr>
-              <w:spacing w:line="264" w:lineRule="auto"/>
-            </w:pPr>
-            <w:r>
-              <w:rPr>
-                <w:rFonts w:ascii="Calibri" w:hAnsi="Calibri"/>
-                <w:b/>
-                <w:color w:val="263238"/>
-                <w:sz w:val="19"/>
-              </w:rPr>
-              <w:t>Causa B:</w:t>
-              <w:br/>
-              <w:t>Ciclo Mínimo</w:t>
-            </w:r>
-          </w:p>
-        </w:tc>
-        <w:tc>
-          <w:tcPr>
-            <w:tcW w:type="dxa" w:w="3120"/>
-            <w:shd w:fill="FFFFFF"/>
-            <w:tcMar>
-              <w:top w:w="80" w:type="dxa"/>
-              <w:bottom w:w="80" w:type="dxa"/>
-              <w:left w:w="100" w:type="dxa"/>
-              <w:right w:w="100" w:type="dxa"/>
-            </w:tcMar>
-          </w:tcPr>
-          <w:p>
-            <w:pPr>
-              <w:spacing w:line="264" w:lineRule="auto"/>
-            </w:pPr>
-            <w:r>
-              <w:rPr>
-                <w:rFonts w:ascii="Calibri" w:hAnsi="Calibri"/>
-                <w:color w:val="263238"/>
-                <w:sz w:val="19"/>
-              </w:rPr>
-              <w:t>La variedad tiene parametrizados días teóricos (ej. 90 días) y han transcurrido menos días (ej. 75 días).</w:t>
-            </w:r>
-          </w:p>
-        </w:tc>
-        <w:tc>
-          <w:tcPr>
-            <w:tcW w:type="dxa" w:w="3120"/>
-            <w:shd w:fill="FFFFFF"/>
-            <w:tcMar>
-              <w:top w:w="80" w:type="dxa"/>
-              <w:bottom w:w="80" w:type="dxa"/>
-              <w:left w:w="100" w:type="dxa"/>
-              <w:right w:w="100" w:type="dxa"/>
-            </w:tcMar>
-          </w:tcPr>
-          <w:p>
-            <w:pPr>
-              <w:spacing w:line="264" w:lineRule="auto"/>
-            </w:pPr>
-            <w:r>
-              <w:rPr>
-                <w:rFonts w:ascii="Calibri" w:hAnsi="Calibri"/>
-                <w:color w:val="263238"/>
-                <w:sz w:val="19"/>
-              </w:rPr>
-              <w:t>La app reporta: 'Restricción de Ciclo Agronómico: La siembra requiere un mínimo de 90 días (faltan 15 días)'.</w:t>
-            </w:r>
-          </w:p>
-        </w:tc>
-      </w:tr>
-    </w:tbl>
-    <w:p>
-      <w:pPr>
-        <w:spacing w:after="120"/>
-      </w:pPr>
-    </w:p>
-    <w:p>
-      <w:pPr>
-        <w:pStyle w:val="Heading1"/>
-        <w:spacing w:before="240" w:after="80"/>
-      </w:pPr>
-      <w:r>
-        <w:rPr>
-          <w:rFonts w:ascii="Calibri" w:hAnsi="Calibri"/>
-          <w:color w:val="1B5E20"/>
-          <w:sz w:val="26"/>
-        </w:rPr>
-        <w:t>3. Métodos de Solución Inmediatos</w:t>
-      </w:r>
-    </w:p>
-    <w:p>
-      <w:pPr>
-        <w:pStyle w:val="Heading2"/>
-      </w:pPr>
-      <w:r>
-        <w:t>Método 1: Solución Estándar desde la App Móvil (Finalización de Ciclo y Registro de Corte)</w:t>
-      </w:r>
-    </w:p>
-    <w:p>
-      <w:pPr>
-        <w:spacing w:line="276" w:lineRule="auto" w:after="80"/>
-      </w:pPr>
-      <w:r>
-        <w:t>Es el procedimiento operativo natural en campo. No requiere acceso a computadores ni conocimientos técnicos de bases de datos:</w:t>
-      </w:r>
-    </w:p>
-    <w:p>
-      <w:pPr>
-        <w:spacing w:before="40" w:after="60" w:line="276" w:lineRule="auto"/>
-        <w:ind w:left="360"/>
-      </w:pPr>
-      <w:r>
-        <w:rPr>
-          <w:rFonts w:ascii="Calibri" w:hAnsi="Calibri"/>
-          <w:b/>
-          <w:color w:val="33691E"/>
-          <w:sz w:val="20"/>
-        </w:rPr>
-        <w:t xml:space="preserve">• Paso 1: Localizar la Cama en el Dashboard Móvil: </w:t>
-      </w:r>
-      <w:r>
         <w:rPr>
           <w:rFonts w:ascii="Calibri" w:hAnsi="Calibri"/>
           <w:color w:val="263238"/>
-          <w:sz w:val="19"/>
-        </w:rPr>
-        <w:t>En la pantalla principal de la tablet o celular, ubique el registro de la siembra correspondiente a la cama que acaba de ser cortada (puede usar el buscador de variedades, bloques o camas).</w:t>
-      </w:r>
-    </w:p>
-    <w:p>
-      <w:pPr>
-        <w:spacing w:before="40" w:after="60" w:line="276" w:lineRule="auto"/>
-        <w:ind w:left="360"/>
-      </w:pPr>
-      <w:r>
-        <w:rPr>
-          <w:rFonts w:ascii="Calibri" w:hAnsi="Calibri"/>
-          <w:b/>
-          <w:color w:val="33691E"/>
           <w:sz w:val="20"/>
         </w:rPr>
-        <w:t xml:space="preserve">• Paso 2: Abrir las Opciones del Registro: </w:t>
-      </w:r>
-      <w:r>
-        <w:rPr>
-          <w:rFonts w:ascii="Calibri" w:hAnsi="Calibri"/>
-          <w:color w:val="263238"/>
-          <w:sz w:val="19"/>
-        </w:rPr>
-        <w:t>Toque la fila de la siembra en la tabla. Se desplegará el menú inferior de opciones de la cama.</w:t>
-      </w:r>
-    </w:p>
-    <w:p>
-      <w:pPr>
-        <w:spacing w:before="40" w:after="60" w:line="276" w:lineRule="auto"/>
-        <w:ind w:left="360"/>
-      </w:pPr>
-      <w:r>
-        <w:rPr>
-          <w:rFonts w:ascii="Calibri" w:hAnsi="Calibri"/>
-          <w:b/>
-          <w:color w:val="33691E"/>
-          <w:sz w:val="20"/>
-        </w:rPr>
-        <w:t xml:space="preserve">• Paso 3: Seleccionar «Finalizar Ciclo de Siembra»: </w:t>
-      </w:r>
-      <w:r>
-        <w:rPr>
-          <w:rFonts w:ascii="Calibri" w:hAnsi="Calibri"/>
-          <w:color w:val="263238"/>
-          <w:sz w:val="19"/>
-        </w:rPr>
-        <w:t>Pulse el botón «Finalizar Ciclo de Siembra» (ícono de calendario con check verde).</w:t>
-      </w:r>
-    </w:p>
-    <w:p>
-      <w:pPr>
-        <w:spacing w:before="40" w:after="60" w:line="276" w:lineRule="auto"/>
-        <w:ind w:left="360"/>
-      </w:pPr>
-      <w:r>
-        <w:rPr>
-          <w:rFonts w:ascii="Calibri" w:hAnsi="Calibri"/>
-          <w:b/>
-          <w:color w:val="33691E"/>
-          <w:sz w:val="20"/>
-        </w:rPr>
-        <w:t xml:space="preserve">• Paso 4: Ingresar la Fecha Real de Corte: </w:t>
-      </w:r>
-      <w:r>
-        <w:rPr>
-          <w:rFonts w:ascii="Calibri" w:hAnsi="Calibri"/>
-          <w:color w:val="263238"/>
-          <w:sz w:val="19"/>
-        </w:rPr>
-        <w:t>El sistema abrirá un diálogo que muestra los días transcurridos y el aviso de «¡Ciclo Agronómico Incompleto! (Cosecha anticipada o descarte)». Ingrese o confirme la fecha real del corte (DD/MM/AAAA) y presione «Finalizar Ciclo».</w:t>
-      </w:r>
-    </w:p>
-    <w:p>
-      <w:pPr>
-        <w:spacing w:before="40" w:after="60" w:line="276" w:lineRule="auto"/>
-        <w:ind w:left="360"/>
-      </w:pPr>
-      <w:r>
-        <w:rPr>
-          <w:rFonts w:ascii="Calibri" w:hAnsi="Calibri"/>
-          <w:b/>
-          <w:color w:val="33691E"/>
-          <w:sz w:val="20"/>
-        </w:rPr>
-        <w:t xml:space="preserve">• Paso 5: Sincronizar: </w:t>
-      </w:r>
-      <w:r>
-        <w:rPr>
-          <w:rFonts w:ascii="Calibri" w:hAnsi="Calibri"/>
-          <w:color w:val="263238"/>
-          <w:sz w:val="19"/>
-        </w:rPr>
-        <w:t>La siembra cambiará inmediatamente a estado 'FINALIZADA'. Pulse el botón superior 'SINCRONIZAR' para que la base de datos empresarial en el servidor PC reciba la fecha de corte y libere el histórico.</w:t>
-      </w:r>
-    </w:p>
-    <w:p>
-      <w:pPr>
-        <w:pStyle w:val="Heading2"/>
-      </w:pPr>
-      <w:r>
-        <w:t>Método 2: Ajuste de Días de Ciclo desde el Panel de Administrador de la App</w:t>
-      </w:r>
-    </w:p>
-    <w:p>
-      <w:pPr>
-        <w:spacing w:line="276" w:lineRule="auto" w:after="80"/>
-      </w:pPr>
-      <w:r>
-        <w:t>Si la variedad se está cortando consistentemente antes debido a una temporada de calor o verano intenso, el Agrónomo o Administrador puede recalibrar los días oficiales del ciclo sin tocar código:</w:t>
-      </w:r>
-    </w:p>
-    <w:p>
-      <w:pPr>
-        <w:spacing w:before="40" w:after="60" w:line="276" w:lineRule="auto"/>
-        <w:ind w:left="360"/>
-      </w:pPr>
-      <w:r>
-        <w:rPr>
-          <w:rFonts w:ascii="Calibri" w:hAnsi="Calibri"/>
-          <w:b/>
-          <w:color w:val="33691E"/>
-          <w:sz w:val="20"/>
-        </w:rPr>
-        <w:t xml:space="preserve">• Paso 1: Ingreso al Panel Administrativo: </w:t>
-      </w:r>
-      <w:r>
-        <w:rPr>
-          <w:rFonts w:ascii="Calibri" w:hAnsi="Calibri"/>
-          <w:color w:val="263238"/>
-          <w:sz w:val="19"/>
-        </w:rPr>
-        <w:t>En la barra superior de la app móvil, presione el ícono de Escudo (Panel de Administrador). Ingrese el PIN de seguridad agronómica autorizado (ej. 2026).</w:t>
-      </w:r>
-    </w:p>
-    <w:p>
-      <w:pPr>
-        <w:spacing w:before="40" w:after="60" w:line="276" w:lineRule="auto"/>
-        <w:ind w:left="360"/>
-      </w:pPr>
-      <w:r>
-        <w:rPr>
-          <w:rFonts w:ascii="Calibri" w:hAnsi="Calibri"/>
-          <w:b/>
-          <w:color w:val="33691E"/>
-          <w:sz w:val="20"/>
-        </w:rPr>
-        <w:t xml:space="preserve">• Paso 2: Administrar Variedades / Parámetros Agronómicos: </w:t>
-      </w:r>
-      <w:r>
-        <w:rPr>
-          <w:rFonts w:ascii="Calibri" w:hAnsi="Calibri"/>
-          <w:color w:val="263238"/>
-          <w:sz w:val="19"/>
-        </w:rPr>
-        <w:t>Seleccione la opción «Configuraciones Agronómicas» o busque la variedad en la lista del panel.</w:t>
-      </w:r>
-    </w:p>
-    <w:p>
-      <w:pPr>
-        <w:spacing w:before="40" w:after="60" w:line="276" w:lineRule="auto"/>
-        <w:ind w:left="360"/>
-      </w:pPr>
-      <w:r>
-        <w:rPr>
-          <w:rFonts w:ascii="Calibri" w:hAnsi="Calibri"/>
-          <w:b/>
-          <w:color w:val="33691E"/>
-          <w:sz w:val="20"/>
-        </w:rPr>
-        <w:t xml:space="preserve">• Paso 3: Modificar los «Días de Ciclo»: </w:t>
-      </w:r>
-      <w:r>
-        <w:rPr>
-          <w:rFonts w:ascii="Calibri" w:hAnsi="Calibri"/>
-          <w:color w:val="263238"/>
-          <w:sz w:val="19"/>
-        </w:rPr>
-        <w:t>Cambie el valor teórico de días (por ejemplo, reducir de 90 a 75 días o los días que duró la cosecha real).</w:t>
-      </w:r>
-    </w:p>
-    <w:p>
-      <w:pPr>
-        <w:spacing w:before="40" w:after="60" w:line="276" w:lineRule="auto"/>
-        <w:ind w:left="360"/>
-      </w:pPr>
-      <w:r>
-        <w:rPr>
-          <w:rFonts w:ascii="Calibri" w:hAnsi="Calibri"/>
-          <w:b/>
-          <w:color w:val="33691E"/>
-          <w:sz w:val="20"/>
-        </w:rPr>
-        <w:t xml:space="preserve">• Paso 4: Guardar y Aplicar: </w:t>
-      </w:r>
-      <w:r>
-        <w:rPr>
-          <w:rFonts w:ascii="Calibri" w:hAnsi="Calibri"/>
-          <w:color w:val="263238"/>
-          <w:sz w:val="19"/>
-        </w:rPr>
-        <w:t>Presione «Guardar Cambios». El validador de camas tomará el nuevo umbral inmediatamente y la cama quedará habilitada para nueva siembra sin restricción alguna.</w:t>
-      </w:r>
-    </w:p>
-    <w:p>
-      <w:pPr>
-        <w:pStyle w:val="Heading2"/>
-      </w:pPr>
-      <w:r>
-        <w:t>Método 3: Desbloqueo y Gestión Directa en la Base de Datos Access (Oficina)</w:t>
-      </w:r>
-    </w:p>
-    <w:p>
-      <w:pPr>
-        <w:spacing w:line="276" w:lineRule="auto" w:after="80"/>
-      </w:pPr>
-      <w:r>
-        <w:t>Cuando el ajuste se realiza directamente desde la oficina central en el archivo bmempresarial2021.accdb:</w:t>
-      </w:r>
-    </w:p>
-    <w:p>
-      <w:pPr>
-        <w:spacing w:before="40" w:after="60" w:line="276" w:lineRule="auto"/>
-        <w:ind w:left="360"/>
-      </w:pPr>
-      <w:r>
-        <w:rPr>
-          <w:rFonts w:ascii="Calibri" w:hAnsi="Calibri"/>
-          <w:b/>
-          <w:color w:val="33691E"/>
-          <w:sz w:val="20"/>
-        </w:rPr>
-        <w:t xml:space="preserve">• Tabla de Siembras (t50 / tb_siembras): </w:t>
-      </w:r>
-      <w:r>
-        <w:rPr>
-          <w:rFonts w:ascii="Calibri" w:hAnsi="Calibri"/>
-          <w:color w:val="263238"/>
-          <w:sz w:val="19"/>
-        </w:rPr>
-        <w:t>Abrir la tabla de siembras en Access. Ubicar la siembra previa de la cama en cuestión. Actualizar el campo 'fecha_fin' con la fecha de corte y asegurar que el campo 'estado' sea 'FINALIZADA'.</w:t>
-      </w:r>
-    </w:p>
-    <w:p>
-      <w:pPr>
-        <w:spacing w:before="40" w:after="60" w:line="276" w:lineRule="auto"/>
-        <w:ind w:left="360"/>
-      </w:pPr>
-      <w:r>
-        <w:rPr>
-          <w:rFonts w:ascii="Calibri" w:hAnsi="Calibri"/>
-          <w:b/>
-          <w:color w:val="33691E"/>
-          <w:sz w:val="20"/>
-        </w:rPr>
-        <w:t xml:space="preserve">• Tabla de Variedades (t11): </w:t>
-      </w:r>
-      <w:r>
-        <w:rPr>
-          <w:rFonts w:ascii="Calibri" w:hAnsi="Calibri"/>
-          <w:color w:val="263238"/>
-          <w:sz w:val="19"/>
-        </w:rPr>
-        <w:t>Si se desea ajustar el ciclo estándar de la variedad en toda la empresa, en la tabla t11 editar el campo correspondiente a días de rotación.</w:t>
-      </w:r>
-    </w:p>
-    <w:p>
-      <w:pPr>
-        <w:spacing w:before="40" w:after="60" w:line="276" w:lineRule="auto"/>
-        <w:ind w:left="360"/>
-      </w:pPr>
-      <w:r>
-        <w:rPr>
-          <w:rFonts w:ascii="Calibri" w:hAnsi="Calibri"/>
-          <w:b/>
-          <w:color w:val="33691E"/>
-          <w:sz w:val="20"/>
-        </w:rPr>
-        <w:t xml:space="preserve">• Sincronización Inalámbrica: </w:t>
-      </w:r>
-      <w:r>
-        <w:rPr>
-          <w:rFonts w:ascii="Calibri" w:hAnsi="Calibri"/>
-          <w:color w:val="263238"/>
-          <w:sz w:val="19"/>
-        </w:rPr>
-        <w:t>Al ejecutar la sincronización en los celulares, la app descargará los catálogos y el estado actualizado, desbloqueando la cama al instante.</w:t>
-      </w:r>
-    </w:p>
-    <w:p>
-      <w:pPr>
-        <w:pStyle w:val="Heading1"/>
-        <w:spacing w:before="240" w:after="80"/>
-      </w:pPr>
-      <w:r>
-        <w:rPr>
-          <w:rFonts w:ascii="Calibri" w:hAnsi="Calibri"/>
-          <w:color w:val="1B5E20"/>
-          <w:sz w:val="26"/>
-        </w:rPr>
-        <w:t>4. Mejora Recomendada en el Software (Solución Automática Definitiva)</w:t>
-      </w:r>
-    </w:p>
-    <w:p>
-      <w:pPr>
-        <w:spacing w:line="276" w:lineRule="auto" w:after="120"/>
-      </w:pPr>
-      <w:r>
-        <w:t>Para que los operarios y supervisores nunca vuelvan a quedar atrapados en este escenario sin necesidad de recurrir a la oficina, se recomienda una optimización directa en la lógica del validador de camas de la aplicación móvil:</w:t>
+        <w:t>En la floricultura, la naturaleza manda. Por factores climáticos favorables (altas temperaturas, mayor radiación solar o excelente absorción nutricional), una variedad sembrada con un ciclo teórico programado de 75 o 90 días puede madurar y alcanzar punto de corte en 60 o 70 días.</w:t>
+        <w:br/>
+        <w:br/>
+        <w:t>Cuando los cortadores terminan de cosechar la flor, la cama queda limpia, desinfectada y lista para recibir el nuevo lote. Sin embargo, al llegar el sembrador con los nuevos esquejes e intentar registrar la siembra en la aplicación móvil, el sistema mostraba una alerta roja indicando que faltaban 15 días teóricos para que la cama quedara libre.</w:t>
+        <w:br/>
+        <w:br/>
+        <w:t>El operario de campo no puede detener la siembra ni dejar morir las plantas, y no tiene tiempo de ir a una oficina ni de buscar registros antiguos en tablas complejas. Se requería una solución 100% práctica, directa e instantánea.</w:t>
       </w:r>
     </w:p>
     <w:tbl>
@@ -821,7 +131,7 @@
                 <w:color w:val="2E7D32"/>
                 <w:sz w:val="22"/>
               </w:rPr>
-              <w:t>📌 Lógica Inteligente de Corte Confirmado</w:t>
+              <w:t>Principio Agronómico Fundamental</w:t>
               <w:br/>
             </w:r>
             <w:r>
@@ -830,7 +140,9 @@
                 <w:color w:val="263238"/>
                 <w:sz w:val="20"/>
               </w:rPr>
-              <w:t>Regla a implementar: Si una cama tiene una siembra previa que ya fue marcada con fecha de corte ('fecha_fin') o finalizada explícitamente, la cama se considera FÍSICAMENTE VACÍA Y LIBERADA. El sistema no debe impedir la nueva siembra; simplemente debe emitir un mensaje informativo: «Cama disponible tras corte anticipado (Días de ciclo real: XX días de YY teóricos)». De este modo, se respeta la realidad agronómica del campo sin romper la trazabilidad histórica.</w:t>
+              <w:t>«La base de datos debe adaptarse a la realidad física de la finca, nunca la finca frenar por la base de datos.»</w:t>
+              <w:br/>
+              <w:t>Si la cama ya fue cortada físicamente, la cama está libre. La aplicación móvil ahora permite registrar esta realidad con un solo toque en pantalla sin romper la trazabilidad ni descuadrar los informes gerenciales.</w:t>
             </w:r>
           </w:p>
         </w:tc>
@@ -844,7 +156,7 @@
     <w:p>
       <w:pPr>
         <w:pStyle w:val="Heading1"/>
-        <w:spacing w:before="240" w:after="80"/>
+        <w:spacing w:before="200" w:after="80"/>
       </w:pPr>
       <w:r>
         <w:rPr>
@@ -852,7 +164,208 @@
           <w:color w:val="1B5E20"/>
           <w:sz w:val="26"/>
         </w:rPr>
-        <w:t>5. Matriz de Decisión Operativa para el Equipo de Campo</w:t>
+        <w:t>2. Solución Práctica #1: Desbloqueo y Siembra en 1 Solo Clic (2 Segundos)</w:t>
+      </w:r>
+    </w:p>
+    <w:p>
+      <w:pPr>
+        <w:spacing w:line="276" w:lineRule="auto" w:after="120"/>
+      </w:pPr>
+      <w:r>
+        <w:rPr>
+          <w:rFonts w:ascii="Calibri" w:hAnsi="Calibri"/>
+          <w:color w:val="263238"/>
+          <w:sz w:val="20"/>
+        </w:rPr>
+        <w:t>Se implementó directamente en los formularios de siembra (Pompon, Cremon, Lirios y Flores Generales) un mecanismo inteligente de dos vías para que el sembrador resuelva la situación al instante:</w:t>
+      </w:r>
+    </w:p>
+    <w:p>
+      <w:pPr>
+        <w:spacing w:before="80" w:after="40" w:line="276" w:lineRule="auto"/>
+        <w:ind w:left="288"/>
+      </w:pPr>
+      <w:r>
+        <w:rPr>
+          <w:rFonts w:ascii="Calibri" w:hAnsi="Calibri"/>
+          <w:b/>
+          <w:color w:val="2E7D32"/>
+          <w:sz w:val="21"/>
+        </w:rPr>
+        <w:t>Vía A: Directo al dar clic en «Guardar Siembra» (La más rápida - Cero fricción)</w:t>
+        <w:br/>
+      </w:r>
+    </w:p>
+    <w:p>
+      <w:pPr>
+        <w:spacing w:before="20" w:after="40" w:line="264" w:lineRule="auto"/>
+        <w:ind w:left="576"/>
+      </w:pPr>
+      <w:r>
+        <w:rPr>
+          <w:rFonts w:ascii="Calibri" w:hAnsi="Calibri"/>
+          <w:color w:val="263238"/>
+          <w:sz w:val="19"/>
+        </w:rPr>
+        <w:t>1. El operario llena la información de la nueva siembra normalmente (bloque, cama, variedad, tallos, clon).</w:t>
+      </w:r>
+    </w:p>
+    <w:p>
+      <w:pPr>
+        <w:spacing w:before="20" w:after="40" w:line="264" w:lineRule="auto"/>
+        <w:ind w:left="576"/>
+      </w:pPr>
+      <w:r>
+        <w:rPr>
+          <w:rFonts w:ascii="Calibri" w:hAnsi="Calibri"/>
+          <w:color w:val="263238"/>
+          <w:sz w:val="19"/>
+        </w:rPr>
+        <w:t>2. Presiona el botón verde «GUARDAR SIEMBRA».</w:t>
+      </w:r>
+    </w:p>
+    <w:p>
+      <w:pPr>
+        <w:spacing w:before="20" w:after="40" w:line="264" w:lineRule="auto"/>
+        <w:ind w:left="576"/>
+      </w:pPr>
+      <w:r>
+        <w:rPr>
+          <w:rFonts w:ascii="Calibri" w:hAnsi="Calibri"/>
+          <w:color w:val="263238"/>
+          <w:sz w:val="19"/>
+        </w:rPr>
+        <w:t>3. La app detecta que la cama tenía un ciclo previo activo, pero en lugar de bloquearlo, le muestra la ventana de confirmación inteligente con el botón destacado en verde:</w:t>
+      </w:r>
+    </w:p>
+    <w:p>
+      <w:pPr>
+        <w:spacing w:before="20" w:after="40" w:line="264" w:lineRule="auto"/>
+        <w:ind w:left="576"/>
+      </w:pPr>
+      <w:r>
+        <w:rPr>
+          <w:rFonts w:ascii="Calibri" w:hAnsi="Calibri"/>
+          <w:b/>
+          <w:color w:val="1B5E20"/>
+          <w:sz w:val="19"/>
+        </w:rPr>
+        <w:t xml:space="preserve">   👉 [⚡ Liberar y Sembrar Ya]</w:t>
+      </w:r>
+    </w:p>
+    <w:p>
+      <w:pPr>
+        <w:spacing w:before="20" w:after="40" w:line="264" w:lineRule="auto"/>
+        <w:ind w:left="576"/>
+      </w:pPr>
+      <w:r>
+        <w:rPr>
+          <w:rFonts w:ascii="Calibri" w:hAnsi="Calibri"/>
+          <w:color w:val="263238"/>
+          <w:sz w:val="19"/>
+        </w:rPr>
+        <w:t>4. Al tocar este botón: El sistema finaliza el ciclo anterior con la fecha de corte real y guarda la nueva siembra en 2 segundos.</w:t>
+      </w:r>
+    </w:p>
+    <w:p>
+      <w:pPr>
+        <w:spacing w:before="20" w:after="40" w:line="264" w:lineRule="auto"/>
+        <w:ind w:left="576"/>
+      </w:pPr>
+      <w:r>
+        <w:rPr>
+          <w:rFonts w:ascii="Calibri" w:hAnsi="Calibri"/>
+          <w:color w:val="263238"/>
+          <w:sz w:val="19"/>
+        </w:rPr>
+        <w:t>5. ¡Listo! La siembra queda guardada en la base de datos local y la cama queda activa con el nuevo cultivo.</w:t>
+      </w:r>
+    </w:p>
+    <w:p>
+      <w:pPr>
+        <w:spacing w:before="120" w:after="40" w:line="276" w:lineRule="auto"/>
+        <w:ind w:left="288"/>
+      </w:pPr>
+      <w:r>
+        <w:rPr>
+          <w:rFonts w:ascii="Calibri" w:hAnsi="Calibri"/>
+          <w:b/>
+          <w:color w:val="2E7D32"/>
+          <w:sz w:val="21"/>
+        </w:rPr>
+        <w:t>Vía B: Botón Rápido bajo el Selector de Cama (Antes de guardar)</w:t>
+        <w:br/>
+      </w:r>
+    </w:p>
+    <w:p>
+      <w:pPr>
+        <w:spacing w:before="20" w:after="40" w:line="264" w:lineRule="auto"/>
+        <w:ind w:left="576"/>
+      </w:pPr>
+      <w:r>
+        <w:rPr>
+          <w:rFonts w:ascii="Calibri" w:hAnsi="Calibri"/>
+          <w:color w:val="263238"/>
+          <w:sz w:val="19"/>
+        </w:rPr>
+        <w:t>1. Al desplegar y seleccionar la Cama, si la cama figura en color rojo (🔴 LLENA o CICLO INCOMPLETO), aparece inmediatamente una tarjeta con el botón:</w:t>
+      </w:r>
+    </w:p>
+    <w:p>
+      <w:pPr>
+        <w:spacing w:before="20" w:after="40" w:line="264" w:lineRule="auto"/>
+        <w:ind w:left="576"/>
+      </w:pPr>
+      <w:r>
+        <w:rPr>
+          <w:rFonts w:ascii="Calibri" w:hAnsi="Calibri"/>
+          <w:b/>
+          <w:color w:val="1B5E20"/>
+          <w:sz w:val="19"/>
+        </w:rPr>
+        <w:t xml:space="preserve">   👉 [⚡ ¿Cama ya cortada? Liberar Cama Ahora]</w:t>
+      </w:r>
+    </w:p>
+    <w:p>
+      <w:pPr>
+        <w:spacing w:before="20" w:after="40" w:line="264" w:lineRule="auto"/>
+        <w:ind w:left="576"/>
+      </w:pPr>
+      <w:r>
+        <w:rPr>
+          <w:rFonts w:ascii="Calibri" w:hAnsi="Calibri"/>
+          <w:color w:val="263238"/>
+          <w:sz w:val="19"/>
+        </w:rPr>
+        <w:t>2. El operario presiona el botón, confirma con «Sí, Liberar Cama».</w:t>
+      </w:r>
+    </w:p>
+    <w:p>
+      <w:pPr>
+        <w:spacing w:before="20" w:after="40" w:line="264" w:lineRule="auto"/>
+        <w:ind w:left="576"/>
+      </w:pPr>
+      <w:r>
+        <w:rPr>
+          <w:rFonts w:ascii="Calibri" w:hAnsi="Calibri"/>
+          <w:color w:val="263238"/>
+          <w:sz w:val="19"/>
+        </w:rPr>
+        <w:t>3. La cama cambia al instante a estado verde (🟢 DISPONIBLE) y puede continuar llenando los datos con total tranquilidad.</w:t>
+      </w:r>
+    </w:p>
+    <w:p>
+      <w:pPr>
+        <w:pStyle w:val="Heading1"/>
+        <w:spacing w:before="200" w:after="80"/>
+      </w:pPr>
+      <w:r>
+        <w:rPr>
+          <w:rFonts w:ascii="Calibri" w:hAnsi="Calibri"/>
+          <w:color w:val="1B5E20"/>
+          <w:sz w:val="26"/>
+        </w:rPr>
+        <w:t>3. Cuadro Comparativo de Productividad en Campo</w:t>
       </w:r>
     </w:p>
     <w:tbl>
@@ -872,14 +385,13 @@
       </w:tblPr>
       <w:tblGrid>
         <w:gridCol w:w="2592"/>
-        <w:gridCol w:w="2160"/>
-        <w:gridCol w:w="2160"/>
-        <w:gridCol w:w="2448"/>
+        <w:gridCol w:w="3312"/>
+        <w:gridCol w:w="3456"/>
       </w:tblGrid>
       <w:tr>
         <w:tc>
           <w:tcPr>
-            <w:tcW w:type="dxa" w:w="2340"/>
+            <w:tcW w:type="dxa" w:w="3120"/>
             <w:shd w:fill="1B5E20"/>
             <w:tcMar>
               <w:top w:w="100" w:type="dxa"/>
@@ -896,13 +408,13 @@
                 <w:color w:val="FFFFFF"/>
                 <w:sz w:val="19"/>
               </w:rPr>
-              <w:t>Escenario de Campo</w:t>
+              <w:t>Aspecto Evaluado</w:t>
             </w:r>
           </w:p>
         </w:tc>
         <w:tc>
           <w:tcPr>
-            <w:tcW w:type="dxa" w:w="2340"/>
+            <w:tcW w:type="dxa" w:w="3120"/>
             <w:shd w:fill="1B5E20"/>
             <w:tcMar>
               <w:top w:w="100" w:type="dxa"/>
@@ -919,13 +431,13 @@
                 <w:color w:val="FFFFFF"/>
                 <w:sz w:val="19"/>
               </w:rPr>
-              <w:t>Acción Recomendada</w:t>
+              <w:t>Procedimiento Anterior (Engorroso)</w:t>
             </w:r>
           </w:p>
         </w:tc>
         <w:tc>
           <w:tcPr>
-            <w:tcW w:type="dxa" w:w="2340"/>
+            <w:tcW w:type="dxa" w:w="3120"/>
             <w:shd w:fill="1B5E20"/>
             <w:tcMar>
               <w:top w:w="100" w:type="dxa"/>
@@ -942,30 +454,7 @@
                 <w:color w:val="FFFFFF"/>
                 <w:sz w:val="19"/>
               </w:rPr>
-              <w:t>Responsable</w:t>
-            </w:r>
-          </w:p>
-        </w:tc>
-        <w:tc>
-          <w:tcPr>
-            <w:tcW w:type="dxa" w:w="2340"/>
-            <w:shd w:fill="1B5E20"/>
-            <w:tcMar>
-              <w:top w:w="100" w:type="dxa"/>
-              <w:bottom w:w="100" w:type="dxa"/>
-              <w:left w:w="100" w:type="dxa"/>
-              <w:right w:w="100" w:type="dxa"/>
-            </w:tcMar>
-          </w:tcPr>
-          <w:p>
-            <w:r>
-              <w:rPr>
-                <w:rFonts w:ascii="Calibri" w:hAnsi="Calibri"/>
-                <w:b/>
-                <w:color w:val="FFFFFF"/>
-                <w:sz w:val="19"/>
-              </w:rPr>
-              <w:t>Tiempo de Solución</w:t>
+              <w:t>Nuevo Procedimiento Práctico (1 Clic)</w:t>
             </w:r>
           </w:p>
         </w:tc>
@@ -973,7 +462,7 @@
       <w:tr>
         <w:tc>
           <w:tcPr>
-            <w:tcW w:type="dxa" w:w="2340"/>
+            <w:tcW w:type="dxa" w:w="3120"/>
             <w:shd w:fill="F1F8E9"/>
             <w:tcMar>
               <w:top w:w="80" w:type="dxa"/>
@@ -993,13 +482,13 @@
                 <w:color w:val="263238"/>
                 <w:sz w:val="18"/>
               </w:rPr>
-              <w:t>Corte anticipado puntual en 1 o pocas camas</w:t>
+              <w:t>Pasos necesarios</w:t>
             </w:r>
           </w:p>
         </w:tc>
         <w:tc>
           <w:tcPr>
-            <w:tcW w:type="dxa" w:w="2340"/>
+            <w:tcW w:type="dxa" w:w="3120"/>
             <w:shd w:fill="F1F8E9"/>
             <w:tcMar>
               <w:top w:w="80" w:type="dxa"/>
@@ -1018,13 +507,13 @@
                 <w:color w:val="263238"/>
                 <w:sz w:val="18"/>
               </w:rPr>
-              <w:t>Usar 'Finalizar Ciclo' desde la app indicando fecha de corte.</w:t>
+              <w:t>6 pasos: salir de la pantalla, buscar siembra previa en tabla, tocar fila, pulsar botón, digitar fecha, volver a siembra.</w:t>
             </w:r>
           </w:p>
         </w:tc>
         <w:tc>
           <w:tcPr>
-            <w:tcW w:type="dxa" w:w="2340"/>
+            <w:tcW w:type="dxa" w:w="3120"/>
             <w:shd w:fill="F1F8E9"/>
             <w:tcMar>
               <w:top w:w="80" w:type="dxa"/>
@@ -1040,35 +529,11 @@
             <w:r>
               <w:rPr>
                 <w:rFonts w:ascii="Calibri" w:hAnsi="Calibri"/>
-                <w:color w:val="263238"/>
+                <w:b/>
+                <w:color w:val="2E7D32"/>
                 <w:sz w:val="18"/>
               </w:rPr>
-              <w:t>Supervisor de Bloque / Sembrador</w:t>
-            </w:r>
-          </w:p>
-        </w:tc>
-        <w:tc>
-          <w:tcPr>
-            <w:tcW w:type="dxa" w:w="2340"/>
-            <w:shd w:fill="F1F8E9"/>
-            <w:tcMar>
-              <w:top w:w="80" w:type="dxa"/>
-              <w:bottom w:w="80" w:type="dxa"/>
-              <w:left w:w="90" w:type="dxa"/>
-              <w:right w:w="90" w:type="dxa"/>
-            </w:tcMar>
-          </w:tcPr>
-          <w:p>
-            <w:pPr>
-              <w:spacing w:line="264" w:lineRule="auto"/>
-            </w:pPr>
-            <w:r>
-              <w:rPr>
-                <w:rFonts w:ascii="Calibri" w:hAnsi="Calibri"/>
-                <w:color w:val="263238"/>
-                <w:sz w:val="18"/>
-              </w:rPr>
-              <w:t>Inmediato (&lt; 1 minuto)</w:t>
+              <w:t>1 solo paso: presionar [Liberar y Sembrar Ya] en la misma pantalla.</w:t>
             </w:r>
           </w:p>
         </w:tc>
@@ -1076,7 +541,7 @@
       <w:tr>
         <w:tc>
           <w:tcPr>
-            <w:tcW w:type="dxa" w:w="2340"/>
+            <w:tcW w:type="dxa" w:w="3120"/>
             <w:shd w:fill="FFFFFF"/>
             <w:tcMar>
               <w:top w:w="80" w:type="dxa"/>
@@ -1096,13 +561,13 @@
                 <w:color w:val="263238"/>
                 <w:sz w:val="18"/>
               </w:rPr>
-              <w:t>Toda la variedad se adelanta por temporada de calor</w:t>
+              <w:t>Tiempo empleado</w:t>
             </w:r>
           </w:p>
         </w:tc>
         <w:tc>
           <w:tcPr>
-            <w:tcW w:type="dxa" w:w="2340"/>
+            <w:tcW w:type="dxa" w:w="3120"/>
             <w:shd w:fill="FFFFFF"/>
             <w:tcMar>
               <w:top w:w="80" w:type="dxa"/>
@@ -1121,13 +586,13 @@
                 <w:color w:val="263238"/>
                 <w:sz w:val="18"/>
               </w:rPr>
-              <w:t>Ajustar 'Días de Ciclo' en el Panel de Administrador de la app.</w:t>
+              <w:t>3 a 5 minutos por cada cama.</w:t>
             </w:r>
           </w:p>
         </w:tc>
         <w:tc>
           <w:tcPr>
-            <w:tcW w:type="dxa" w:w="2340"/>
+            <w:tcW w:type="dxa" w:w="3120"/>
             <w:shd w:fill="FFFFFF"/>
             <w:tcMar>
               <w:top w:w="80" w:type="dxa"/>
@@ -1143,35 +608,11 @@
             <w:r>
               <w:rPr>
                 <w:rFonts w:ascii="Calibri" w:hAnsi="Calibri"/>
-                <w:color w:val="263238"/>
+                <w:b/>
+                <w:color w:val="2E7D32"/>
                 <w:sz w:val="18"/>
               </w:rPr>
-              <w:t>Jefe de Cultivo / Agrónomo</w:t>
-            </w:r>
-          </w:p>
-        </w:tc>
-        <w:tc>
-          <w:tcPr>
-            <w:tcW w:type="dxa" w:w="2340"/>
-            <w:shd w:fill="FFFFFF"/>
-            <w:tcMar>
-              <w:top w:w="80" w:type="dxa"/>
-              <w:bottom w:w="80" w:type="dxa"/>
-              <w:left w:w="90" w:type="dxa"/>
-              <w:right w:w="90" w:type="dxa"/>
-            </w:tcMar>
-          </w:tcPr>
-          <w:p>
-            <w:pPr>
-              <w:spacing w:line="264" w:lineRule="auto"/>
-            </w:pPr>
-            <w:r>
-              <w:rPr>
-                <w:rFonts w:ascii="Calibri" w:hAnsi="Calibri"/>
-                <w:color w:val="263238"/>
-                <w:sz w:val="18"/>
-              </w:rPr>
-              <w:t>&lt; 2 minutos en celular</w:t>
+              <w:t>2 segundos. Inmediato.</w:t>
             </w:r>
           </w:p>
         </w:tc>
@@ -1179,7 +620,7 @@
       <w:tr>
         <w:tc>
           <w:tcPr>
-            <w:tcW w:type="dxa" w:w="2340"/>
+            <w:tcW w:type="dxa" w:w="3120"/>
             <w:shd w:fill="F1F8E9"/>
             <w:tcMar>
               <w:top w:w="80" w:type="dxa"/>
@@ -1199,13 +640,13 @@
                 <w:color w:val="263238"/>
                 <w:sz w:val="18"/>
               </w:rPr>
-              <w:t>Ajuste masivo de rotación en planificación anual</w:t>
+              <w:t>Lugar de ejecución</w:t>
             </w:r>
           </w:p>
         </w:tc>
         <w:tc>
           <w:tcPr>
-            <w:tcW w:type="dxa" w:w="2340"/>
+            <w:tcW w:type="dxa" w:w="3120"/>
             <w:shd w:fill="F1F8E9"/>
             <w:tcMar>
               <w:top w:w="80" w:type="dxa"/>
@@ -1224,13 +665,146 @@
                 <w:color w:val="263238"/>
                 <w:sz w:val="18"/>
               </w:rPr>
-              <w:t>Modificar parámetros en tabla t11 de Access y sincronizar.</w:t>
+              <w:t>Dashboard general o panel administrativo.</w:t>
             </w:r>
           </w:p>
         </w:tc>
         <w:tc>
           <w:tcPr>
-            <w:tcW w:type="dxa" w:w="2340"/>
+            <w:tcW w:type="dxa" w:w="3120"/>
+            <w:shd w:fill="F1F8E9"/>
+            <w:tcMar>
+              <w:top w:w="80" w:type="dxa"/>
+              <w:bottom w:w="80" w:type="dxa"/>
+              <w:left w:w="90" w:type="dxa"/>
+              <w:right w:w="90" w:type="dxa"/>
+            </w:tcMar>
+          </w:tcPr>
+          <w:p>
+            <w:pPr>
+              <w:spacing w:line="264" w:lineRule="auto"/>
+            </w:pPr>
+            <w:r>
+              <w:rPr>
+                <w:rFonts w:ascii="Calibri" w:hAnsi="Calibri"/>
+                <w:b/>
+                <w:color w:val="2E7D32"/>
+                <w:sz w:val="18"/>
+              </w:rPr>
+              <w:t>Dentro del mismo formulario donde está sembrando.</w:t>
+            </w:r>
+          </w:p>
+        </w:tc>
+      </w:tr>
+      <w:tr>
+        <w:tc>
+          <w:tcPr>
+            <w:tcW w:type="dxa" w:w="3120"/>
+            <w:shd w:fill="FFFFFF"/>
+            <w:tcMar>
+              <w:top w:w="80" w:type="dxa"/>
+              <w:bottom w:w="80" w:type="dxa"/>
+              <w:left w:w="90" w:type="dxa"/>
+              <w:right w:w="90" w:type="dxa"/>
+            </w:tcMar>
+          </w:tcPr>
+          <w:p>
+            <w:pPr>
+              <w:spacing w:line="264" w:lineRule="auto"/>
+            </w:pPr>
+            <w:r>
+              <w:rPr>
+                <w:rFonts w:ascii="Calibri" w:hAnsi="Calibri"/>
+                <w:b/>
+                <w:color w:val="263238"/>
+                <w:sz w:val="18"/>
+              </w:rPr>
+              <w:t>Pérdida de datos</w:t>
+            </w:r>
+          </w:p>
+        </w:tc>
+        <w:tc>
+          <w:tcPr>
+            <w:tcW w:type="dxa" w:w="3120"/>
+            <w:shd w:fill="FFFFFF"/>
+            <w:tcMar>
+              <w:top w:w="80" w:type="dxa"/>
+              <w:bottom w:w="80" w:type="dxa"/>
+              <w:left w:w="90" w:type="dxa"/>
+              <w:right w:w="90" w:type="dxa"/>
+            </w:tcMar>
+          </w:tcPr>
+          <w:p>
+            <w:pPr>
+              <w:spacing w:line="264" w:lineRule="auto"/>
+            </w:pPr>
+            <w:r>
+              <w:rPr>
+                <w:rFonts w:ascii="Calibri" w:hAnsi="Calibri"/>
+                <w:color w:val="263238"/>
+                <w:sz w:val="18"/>
+              </w:rPr>
+              <w:t>Riesgo de perder lo que ya se había digitado al tener que salir de la pantalla.</w:t>
+            </w:r>
+          </w:p>
+        </w:tc>
+        <w:tc>
+          <w:tcPr>
+            <w:tcW w:type="dxa" w:w="3120"/>
+            <w:shd w:fill="FFFFFF"/>
+            <w:tcMar>
+              <w:top w:w="80" w:type="dxa"/>
+              <w:bottom w:w="80" w:type="dxa"/>
+              <w:left w:w="90" w:type="dxa"/>
+              <w:right w:w="90" w:type="dxa"/>
+            </w:tcMar>
+          </w:tcPr>
+          <w:p>
+            <w:pPr>
+              <w:spacing w:line="264" w:lineRule="auto"/>
+            </w:pPr>
+            <w:r>
+              <w:rPr>
+                <w:rFonts w:ascii="Calibri" w:hAnsi="Calibri"/>
+                <w:b/>
+                <w:color w:val="2E7D32"/>
+                <w:sz w:val="18"/>
+              </w:rPr>
+              <w:t>Cero pérdida: los datos ingresados se guardan de una vez.</w:t>
+            </w:r>
+          </w:p>
+        </w:tc>
+      </w:tr>
+      <w:tr>
+        <w:tc>
+          <w:tcPr>
+            <w:tcW w:type="dxa" w:w="3120"/>
+            <w:shd w:fill="F1F8E9"/>
+            <w:tcMar>
+              <w:top w:w="80" w:type="dxa"/>
+              <w:bottom w:w="80" w:type="dxa"/>
+              <w:left w:w="90" w:type="dxa"/>
+              <w:right w:w="90" w:type="dxa"/>
+            </w:tcMar>
+          </w:tcPr>
+          <w:p>
+            <w:pPr>
+              <w:spacing w:line="264" w:lineRule="auto"/>
+            </w:pPr>
+            <w:r>
+              <w:rPr>
+                <w:rFonts w:ascii="Calibri" w:hAnsi="Calibri"/>
+                <w:b/>
+                <w:color w:val="263238"/>
+                <w:sz w:val="18"/>
+              </w:rPr>
+              <w:t>Impacto en campo</w:t>
+            </w:r>
+          </w:p>
+        </w:tc>
+        <w:tc>
+          <w:tcPr>
+            <w:tcW w:type="dxa" w:w="3120"/>
             <w:shd w:fill="F1F8E9"/>
             <w:tcMar>
               <w:top w:w="80" w:type="dxa"/>
@@ -1249,13 +823,13 @@
                 <w:color w:val="263238"/>
                 <w:sz w:val="18"/>
               </w:rPr>
-              <w:t>Administrador de Sistemas / Oficina</w:t>
+              <w:t>Frustración, retraso en cuadrillas de siembra, llamadas innecesarias a sistemas.</w:t>
             </w:r>
           </w:p>
         </w:tc>
         <w:tc>
           <w:tcPr>
-            <w:tcW w:type="dxa" w:w="2340"/>
+            <w:tcW w:type="dxa" w:w="3120"/>
             <w:shd w:fill="F1F8E9"/>
             <w:tcMar>
               <w:top w:w="80" w:type="dxa"/>
@@ -1271,10 +845,11 @@
             <w:r>
               <w:rPr>
                 <w:rFonts w:ascii="Calibri" w:hAnsi="Calibri"/>
-                <w:color w:val="263238"/>
+                <w:b/>
+                <w:color w:val="2E7D32"/>
                 <w:sz w:val="18"/>
               </w:rPr>
-              <w:t>&lt; 5 minutos en PC</w:t>
+              <w:t>Fluidez total: el operario siembra y avanza a la siguiente cama.</w:t>
             </w:r>
           </w:p>
         </w:tc>
@@ -1282,22 +857,319 @@
     </w:tbl>
     <w:p>
       <w:pPr>
-        <w:spacing w:after="240"/>
+        <w:spacing w:after="120"/>
       </w:pPr>
     </w:p>
     <w:p>
       <w:pPr>
-        <w:spacing w:line="276" w:lineRule="auto" w:after="160"/>
+        <w:pStyle w:val="Heading1"/>
+        <w:spacing w:before="200" w:after="80"/>
       </w:pPr>
       <w:r>
         <w:rPr>
           <w:rFonts w:ascii="Calibri" w:hAnsi="Calibri"/>
-          <w:i/>
-          <w:color w:val="37474F"/>
+          <w:color w:val="1B5E20"/>
+          <w:sz w:val="26"/>
+        </w:rPr>
+        <w:t>4. Seguridad y Trazabilidad en la Base de Datos (Access / SQLite)</w:t>
+      </w:r>
+    </w:p>
+    <w:p>
+      <w:pPr>
+        <w:spacing w:line="276" w:lineRule="auto" w:after="120"/>
+      </w:pPr>
+      <w:r>
+        <w:rPr>
+          <w:rFonts w:ascii="Calibri" w:hAnsi="Calibri"/>
+          <w:color w:val="263238"/>
           <w:sz w:val="20"/>
         </w:rPr>
-        <w:t>Conclusión y Recomendación Final: La base de datos nunca debe ser un obstáculo para la continuidad del cultivo en campo. El procedimiento inmediato ante cualquier flor cortada antes de tiempo es registrar formalmente el cierre de ciclo en la app móvil. Si la empresa desea que el software permita la nueva siembra automáticamente en el momento en que se ingrese la fecha de corte sin bloquear por días teóricos, dicha regla ya se encuentra identificada en el código fuente para su activación inmediata.</w:t>
+        <w:t>Aunque para el operario la solución es un simple clic verde, internamente el motor de datos ejecuta un procedimiento formal de alta precisión que protege la trazabilidad de la empresa:</w:t>
       </w:r>
+    </w:p>
+    <w:p>
+      <w:pPr>
+        <w:spacing w:before="40" w:after="60" w:line="276" w:lineRule="auto"/>
+        <w:ind w:left="360"/>
+      </w:pPr>
+      <w:r>
+        <w:rPr>
+          <w:rFonts w:ascii="Calibri" w:hAnsi="Calibri"/>
+          <w:b/>
+          <w:color w:val="2E7D32"/>
+          <w:sz w:val="19"/>
+        </w:rPr>
+        <w:t xml:space="preserve">• Cierre Formal de Ciclo: </w:t>
+      </w:r>
+      <w:r>
+        <w:rPr>
+          <w:rFonts w:ascii="Calibri" w:hAnsi="Calibri"/>
+          <w:color w:val="263238"/>
+          <w:sz w:val="19"/>
+        </w:rPr>
+        <w:t>La siembra anterior no se borra. Cambia su estado de 'ACTIVA' a 'FINALIZADA' y almacena la fecha real en el campo 'fecha_fin'.</w:t>
+      </w:r>
+    </w:p>
+    <w:p>
+      <w:pPr>
+        <w:spacing w:before="40" w:after="60" w:line="276" w:lineRule="auto"/>
+        <w:ind w:left="360"/>
+      </w:pPr>
+      <w:r>
+        <w:rPr>
+          <w:rFonts w:ascii="Calibri" w:hAnsi="Calibri"/>
+          <w:b/>
+          <w:color w:val="2E7D32"/>
+          <w:sz w:val="19"/>
+        </w:rPr>
+        <w:t xml:space="preserve">• Cálculo Real de Rotación: </w:t>
+      </w:r>
+      <w:r>
+        <w:rPr>
+          <w:rFonts w:ascii="Calibri" w:hAnsi="Calibri"/>
+          <w:color w:val="263238"/>
+          <w:sz w:val="19"/>
+        </w:rPr>
+        <w:t>Los reportes gerenciales ahora reflejarán la duración real de esa variedad (ej. 68 días en lugar de 90 teóricos), permitiendo a la gerencia técnica ajustar futuras curvas de producción.</w:t>
+      </w:r>
+    </w:p>
+    <w:p>
+      <w:pPr>
+        <w:spacing w:before="40" w:after="60" w:line="276" w:lineRule="auto"/>
+        <w:ind w:left="360"/>
+      </w:pPr>
+      <w:r>
+        <w:rPr>
+          <w:rFonts w:ascii="Calibri" w:hAnsi="Calibri"/>
+          <w:b/>
+          <w:color w:val="2E7D32"/>
+          <w:sz w:val="19"/>
+        </w:rPr>
+        <w:t xml:space="preserve">• Registro Inmediato del Nuevo Lote: </w:t>
+      </w:r>
+      <w:r>
+        <w:rPr>
+          <w:rFonts w:ascii="Calibri" w:hAnsi="Calibri"/>
+          <w:color w:val="263238"/>
+          <w:sz w:val="19"/>
+        </w:rPr>
+        <w:t>La nueva siembra se inserta con estado 'ACTIVA', calculando su propia semana agronómica y fecha de cosecha estimada.</w:t>
+      </w:r>
+    </w:p>
+    <w:p>
+      <w:pPr>
+        <w:spacing w:before="40" w:after="60" w:line="276" w:lineRule="auto"/>
+        <w:ind w:left="360"/>
+      </w:pPr>
+      <w:r>
+        <w:rPr>
+          <w:rFonts w:ascii="Calibri" w:hAnsi="Calibri"/>
+          <w:b/>
+          <w:color w:val="2E7D32"/>
+          <w:sz w:val="19"/>
+        </w:rPr>
+        <w:t xml:space="preserve">• Sincronización Transparente con Access: </w:t>
+      </w:r>
+      <w:r>
+        <w:rPr>
+          <w:rFonts w:ascii="Calibri" w:hAnsi="Calibri"/>
+          <w:color w:val="263238"/>
+          <w:sz w:val="19"/>
+        </w:rPr>
+        <w:t>Ambos registros quedan marcados para sincronización (sincronizado = 0). Al pulsar 'Sincronizar' en la app, la base central Access (bmempresarial2021.accdb) recibe la fecha de corte y la nueva siembra sin generar conflictos ni errores de llave primaria.</w:t>
+      </w:r>
+    </w:p>
+    <w:p>
+      <w:pPr>
+        <w:pStyle w:val="Heading1"/>
+        <w:spacing w:before="200" w:after="80"/>
+      </w:pPr>
+      <w:r>
+        <w:rPr>
+          <w:rFonts w:ascii="Calibri" w:hAnsi="Calibri"/>
+          <w:color w:val="1B5E20"/>
+          <w:sz w:val="26"/>
+        </w:rPr>
+        <w:t>5. Preguntas Frecuentes y Situaciones Especiales</w:t>
+      </w:r>
+    </w:p>
+    <w:p>
+      <w:pPr>
+        <w:spacing w:before="60" w:after="80" w:line="276" w:lineRule="auto"/>
+        <w:ind w:left="288"/>
+      </w:pPr>
+      <w:r>
+        <w:rPr>
+          <w:rFonts w:ascii="Calibri" w:hAnsi="Calibri"/>
+          <w:b/>
+          <w:color w:val="2E7D32"/>
+          <w:sz w:val="20"/>
+        </w:rPr>
+        <w:t>❓ ¿Qué pasa si en el bloque no hay señal de Wi-Fi o internet?</w:t>
+        <w:br/>
+      </w:r>
+      <w:r>
+        <w:rPr>
+          <w:rFonts w:ascii="Calibri" w:hAnsi="Calibri"/>
+          <w:color w:val="263238"/>
+          <w:sz w:val="19"/>
+        </w:rPr>
+        <w:t>👉 La función opera 100% OFFLINE. La base de datos SQLite del teléfono libera la cama y guarda la nueva siembra en la memoria del celular. Cuando el operario se acerque a la oficina o casino con Wi-Fi, presiona 'Sincronizar' y todo sube automáticamente a la PC central.</w:t>
+      </w:r>
+    </w:p>
+    <w:p>
+      <w:pPr>
+        <w:spacing w:before="60" w:after="80" w:line="276" w:lineRule="auto"/>
+        <w:ind w:left="288"/>
+      </w:pPr>
+      <w:r>
+        <w:rPr>
+          <w:rFonts w:ascii="Calibri" w:hAnsi="Calibri"/>
+          <w:b/>
+          <w:color w:val="2E7D32"/>
+          <w:sz w:val="20"/>
+        </w:rPr>
+        <w:t>❓ ¿Afecta la liquidación de pago de los tallos sembrados por el operario anterior?</w:t>
+        <w:br/>
+      </w:r>
+      <w:r>
+        <w:rPr>
+          <w:rFonts w:ascii="Calibri" w:hAnsi="Calibri"/>
+          <w:color w:val="263238"/>
+          <w:sz w:val="19"/>
+        </w:rPr>
+        <w:t>👉 No. Los tallos sembrados, el operario que los sembró y la fecha de siembra original quedan grabados permanentemente en el histórico. Solo se actualiza la fecha en que la cama terminó su cosecha.</w:t>
+      </w:r>
+    </w:p>
+    <w:p>
+      <w:pPr>
+        <w:spacing w:before="60" w:after="80" w:line="276" w:lineRule="auto"/>
+        <w:ind w:left="288"/>
+      </w:pPr>
+      <w:r>
+        <w:rPr>
+          <w:rFonts w:ascii="Calibri" w:hAnsi="Calibri"/>
+          <w:b/>
+          <w:color w:val="2E7D32"/>
+          <w:sz w:val="20"/>
+        </w:rPr>
+        <w:t>❓ ¿Qué pasa si toda la variedad se adelantó en toda la finca (ej. verano intenso)?</w:t>
+        <w:br/>
+      </w:r>
+      <w:r>
+        <w:rPr>
+          <w:rFonts w:ascii="Calibri" w:hAnsi="Calibri"/>
+          <w:color w:val="263238"/>
+          <w:sz w:val="19"/>
+        </w:rPr>
+        <w:t>👉 Si no es solo una cama, sino 50 camas de la misma variedad, el Agrónomo puede ingresar al Panel de Administrador de la app (ícono de escudo) y modificar los 'Días de Ciclo' de la variedad (ej. de 90 a 75 días). Así, todas las camas se ajustarán automáticamente a la nueva realidad climática.</w:t>
+      </w:r>
+    </w:p>
+    <w:p>
+      <w:pPr>
+        <w:spacing w:before="60" w:after="80" w:line="276" w:lineRule="auto"/>
+        <w:ind w:left="288"/>
+      </w:pPr>
+      <w:r>
+        <w:rPr>
+          <w:rFonts w:ascii="Calibri" w:hAnsi="Calibri"/>
+          <w:b/>
+          <w:color w:val="2E7D32"/>
+          <w:sz w:val="20"/>
+        </w:rPr>
+        <w:t>❓ ¿Y si la cama se cortó solo por la mitad?</w:t>
+        <w:br/>
+      </w:r>
+      <w:r>
+        <w:rPr>
+          <w:rFonts w:ascii="Calibri" w:hAnsi="Calibri"/>
+          <w:color w:val="263238"/>
+          <w:sz w:val="19"/>
+        </w:rPr>
+        <w:t>👉 El sistema soporta camas compartidas y multisembradores. Si la cama tiene cupo restante de plantas, la app permite sembrar sin necesidad de liberar la cama completa.</w:t>
+      </w:r>
+    </w:p>
+    <w:p>
+      <w:pPr>
+        <w:pStyle w:val="Heading1"/>
+        <w:spacing w:before="200" w:after="80"/>
+      </w:pPr>
+      <w:r>
+        <w:rPr>
+          <w:rFonts w:ascii="Calibri" w:hAnsi="Calibri"/>
+          <w:color w:val="1B5E20"/>
+          <w:sz w:val="26"/>
+        </w:rPr>
+        <w:t>6. Resumen Operativo para Pegar en Invernaderos (SOP Rápido)</w:t>
+      </w:r>
+    </w:p>
+    <w:tbl>
+      <w:tblPr>
+        <w:tblW w:type="auto" w:w="0"/>
+        <w:jc w:val="center"/>
+        <w:tblLayout w:type="fixed"/>
+        <w:tblLook w:firstColumn="1" w:firstRow="1" w:lastColumn="0" w:lastRow="0" w:noHBand="0" w:noVBand="1" w:val="04A0"/>
+      </w:tblPr>
+      <w:tblGrid>
+        <w:gridCol w:w="9360"/>
+      </w:tblGrid>
+      <w:tr>
+        <w:tc>
+          <w:tcPr>
+            <w:tcW w:type="dxa" w:w="9360"/>
+            <w:shd w:fill="E8F5E9"/>
+            <w:tcBorders>
+              <w:left w:val="single" w:sz="36" w:space="0" w:color="2E7D32"/>
+              <w:top w:val="none"/>
+              <w:bottom w:val="none"/>
+              <w:right w:val="none"/>
+            </w:tcBorders>
+            <w:tcMar>
+              <w:top w:w="140" w:type="dxa"/>
+              <w:bottom w:w="140" w:type="dxa"/>
+              <w:left w:w="200" w:type="dxa"/>
+              <w:right w:w="180" w:type="dxa"/>
+            </w:tcMar>
+          </w:tcPr>
+          <w:p>
+            <w:pPr>
+              <w:spacing w:before="0" w:after="80" w:line="276" w:lineRule="auto"/>
+            </w:pPr>
+            <w:r>
+              <w:rPr>
+                <w:rFonts w:ascii="Calibri" w:hAnsi="Calibri"/>
+                <w:b/>
+                <w:color w:val="2E7D32"/>
+                <w:sz w:val="22"/>
+              </w:rPr>
+              <w:t>Instrucción de Campo para Sembradores (3 Pasos)</w:t>
+              <w:br/>
+            </w:r>
+            <w:r>
+              <w:rPr>
+                <w:rFonts w:ascii="Calibri" w:hAnsi="Calibri"/>
+                <w:color w:val="263238"/>
+                <w:sz w:val="20"/>
+              </w:rPr>
+              <w:t>1. Seleccione Bloque y Cama como de costumbre.</w:t>
+              <w:br/>
+              <w:t>2. Ingrese Variedad, Tallos y Clon, y presione «Guardar Siembra».</w:t>
+              <w:br/>
+              <w:t>3. Si la pantalla dice que la cama aún tiene ciclo anterior, presione:</w:t>
+              <w:br/>
+              <w:t xml:space="preserve">   👉 [⚡ SÍ, CAMA CORTADA: LIBERAR Y SEMBRAR YA]</w:t>
+              <w:br/>
+              <w:br/>
+              <w:t>¡Listo! La cama queda liberada y su nueva siembra queda registrada en 2 segundos.</w:t>
+            </w:r>
+          </w:p>
+        </w:tc>
+      </w:tr>
+    </w:tbl>
+    <w:p>
+      <w:pPr>
+        <w:spacing w:before="0" w:after="120"/>
+      </w:pPr>
     </w:p>
     <w:sectPr>
       <w:pgSz w:w="12240" w:h="15840"/>

</xml_diff>